<commit_message>
Revise opening report: data-anchored innovation points, Li||NCM811 4.5 V focus
Co-authored-by: arena-agent <297053741+arena-agent@users.noreply.github.com>
</commit_message>
<xml_diff>
--- a/gpe_scientific_questions/MBA_GPE_Opening_Report.docx
+++ b/gpe_scientific_questions/MBA_GPE_Opening_Report.docx
@@ -27,7 +27,7 @@
         <w:t>论文题目：</w:t>
       </w:r>
       <w:r>
-        <w:t xml:space="preserve"> 聚合诱导相分离构筑酰胺骨架/氟化弱溶剂化液相准固态电解质及其高压锂电池应用研究</w:t>
+        <w:t xml:space="preserve"> 酰胺交联网络/氟化弱溶剂化电解液原位凝胶电解质的构筑及其在高压锂金属电池中的应用研究</w:t>
       </w:r>
     </w:p>
     <w:p>
@@ -43,7 +43,7 @@
         <w:t>体系：</w:t>
       </w:r>
       <w:r>
-        <w:t xml:space="preserve"> N,N'-亚甲基双丙烯酰胺（MBA）原位聚合 / 1.0 M LiPF₆ + 0.2 M LiDFOB in N,N-二甲基三氟乙酰胺（DMTFA）: 1,1,2,2-四氟乙基-2,2,3,3-四氟丙基醚（TTE）= 1 : 1（v/v）</w:t>
+        <w:t xml:space="preserve"> N,N'-亚甲基双丙烯酰胺（MBA）原位聚合 / 1.0 M LiPF₆ + 0.2 M LiDFOB in N,N-二甲基三氟乙酰胺（DMTFA）: 1,1,2,2-四氟乙基-2,2,3,3-四氟丙基醚（TTE）= 1 : 1（v/v）；Li‖LiNi₀.₈Co₀.₁Mn₀.₁O₂（NCM811），截止电压 4.5 V</w:t>
       </w:r>
     </w:p>
     <w:p>
@@ -52,7 +52,7 @@
           <w:i/>
           <w:sz w:val="21"/>
         </w:rPr>
-        <w:t>说明：文中【】内为需要报告人根据实际情况补充或核对的内容（姓名、导师、课题来源、电极材料、预实验数据等）。所有"预期""拟"字样的机理均为设计假设，开题阶段不作为已验证结论。</w:t>
+        <w:t>说明：文中【】内为需要报告人补充的具体数值、图号或课题信息。机理性表述中凡标注"预期/推测"的均为设计假设。</w:t>
       </w:r>
     </w:p>
     <w:p>
@@ -116,7 +116,7 @@
         <w:t>内容概述：</w:t>
       </w:r>
       <w:r>
-        <w:t xml:space="preserve"> 本课题以高安全、高电压锂电池用准固态电解质为目标，选用双丙烯酰胺类单体 MBA 在氟化弱溶剂化电解液（1.0 M LiPF₆ + 0.2 M LiDFOB / DMTFA : TTE = 1 : 1）中原位聚合。前期实验发现，MBA 体系在该液相中发生聚合诱导相分离（PIPS），形成白色、非均相的"酰胺微颗粒骨架 + 连续液相"结构；与之对照，均相透明的 PEGDA 凝胶电解质性能反而更差。本课题拟围绕这一现象，系统研究：(1) 相分离骨架与 Li⁺ 传输通道的空间解耦机制；(2) 相分离程度的调控规律及其与保液、力学、传输、界面性能的构效关系；(3) 氟化弱溶剂化液相在准固态化后的溶剂化结构保留；(4) 锂盐/氟化溶剂/酰胺骨架三源协同形成的正负极界面膜化学，最终在【高镍三元 NCM811 / 高压钴酸锂 / 其他】‖【锂金属 / 石墨】全电池中验证其高压长循环性能。</w:t>
+        <w:t xml:space="preserve"> 本课题面向高电压锂金属电池对高安全、高性能电解质的需求，以 N,N'-亚甲基双丙烯酰胺（MBA）为单体，在氟化弱溶剂化电解液（1.0 M LiPF₆ + 0.2 M LiDFOB / DMTFA : TTE = 1 : 1）中原位聚合制备凝胶电解质。前期研究表明，该凝胶电解质在凝胶化后保持了与液态电解液一致的 Li⁺ 溶剂化结构和相近的离子电导率，Li⁺ 迁移数高于液态电解液及同液相的 PEGDA 凝胶，并支持 Li‖NCM811 在 4.5 V 下 1C/3C 稳定循环。本课题拟在此基础上系统研究：(1) 酰胺网络与弱溶剂化液相的相互作用及凝胶化前后溶剂化结构与 Li⁺ 传输机制；(2) 酰胺基团氢键作用对阴离子的调控及其对迁移数的贡献；(3) LiPF₆/LiDFOB 双盐与氟化溶剂在凝胶中构筑正负极界面的化学组成与稳定性；(4) 全电池高压高倍率性能与安全性评价。</w:t>
       </w:r>
     </w:p>
     <w:p>
@@ -140,7 +140,7 @@
         <w:t>（1）应用背景。</w:t>
       </w:r>
       <w:r>
-        <w:t xml:space="preserve"> 高比能锂电池向高电压正极（≥4.4 V）和锂金属负极发展，对电解质同时提出了高氧化稳定性、与负极相容、不燃、不漏液的要求。商用碳酸酯液态电解液氧化窗口不足、易燃、易漏，是制约高安全高比能电池的核心短板之一。</w:t>
+        <w:t xml:space="preserve"> 高比能锂电池向高镍正极（≥4.4 V）和锂金属负极发展，要求电解质同时满足高氧化稳定性、与锂金属相容、不燃、不漏液。商用碳酸酯液态电解液氧化窗口不足、易燃、易漏，是制约高安全高比能电池的核心短板。</w:t>
       </w:r>
     </w:p>
     <w:p>
@@ -156,7 +156,7 @@
         <w:t>（2）液态电解液的进展与局限。</w:t>
       </w:r>
       <w:r>
-        <w:t xml:space="preserve"> 近年来，弱溶剂化电解液、局部高浓电解液（LHCE）、氟化溶剂与双盐成膜策略显著提升了液态电解液的高压耐受性和界面稳定性。然而这些成果绝大多数停留在液态，可燃性与漏液风险依旧存在，且液态电解液与电极间的物理接触在长循环中逐渐退化。</w:t>
+        <w:t xml:space="preserve"> 弱溶剂化电解液、局部高浓电解液（LHCE）、氟化溶剂与双盐成膜策略显著提升了液态电解液的高压耐受性和锂金属库仑效率，但这些成果绝大多数停留在液态，可燃性与漏液风险依旧，且液态电解液与电极的物理接触在长循环中逐渐退化。</w:t>
       </w:r>
     </w:p>
     <w:p>
@@ -169,28 +169,10 @@
         <w:rPr>
           <w:b/>
         </w:rPr>
-        <w:t>（3）凝胶/准固态电解质的两大共性瓶颈。</w:t>
+        <w:t>（3）凝胶电解质的两大共性瓶颈。</w:t>
       </w:r>
       <w:r>
-        <w:t xml:space="preserve"> 凝胶聚合物电解质（GPE）被视为液态与全固态之间的折中方案，但传统均相溶胀型 GPE 普遍面临：① </w:t>
-      </w:r>
-      <w:r>
-        <w:rPr>
-          <w:b/>
-        </w:rPr>
-        <w:t>体相传输下降</w:t>
-      </w:r>
-      <w:r>
-        <w:t xml:space="preserve">——聚合物极性基团（尤其聚醚的醚氧）参与 Li⁺ 配位，Li⁺ 由液相自由扩散转为链段辅助跳跃，电导率和迁移数下降，并改变了液相原有的溶剂化结构；② </w:t>
-      </w:r>
-      <w:r>
-        <w:rPr>
-          <w:b/>
-        </w:rPr>
-        <w:t>界面不稳</w:t>
-      </w:r>
-      <w:r>
-        <w:t>——凝胶与电极接触、SEI/CEI 的均匀性及其循环中的重构难以兼顾。</w:t>
+        <w:t xml:space="preserve"> 凝胶聚合物电解质（GPE）是液态与全固态之间的折中方案，但传统均相溶胀型 GPE 普遍面临：① 聚合物极性基团（尤其聚醚醚氧）参与 Li⁺ 配位，改变液相原有溶剂化结构，电导率和迁移数下降；② 凝胶与电极界面的 SEI/CEI 均匀性与循环稳定性难以兼顾。</w:t>
       </w:r>
     </w:p>
     <w:p>
@@ -206,7 +188,7 @@
         <w:t>（4）本课题的意义。</w:t>
       </w:r>
       <w:r>
-        <w:t xml:space="preserve"> 本课题提出以聚合诱导相分离构筑"刚性酰胺骨架 + 连续液相"的空间解耦结构，使聚合物只承担锁液与骨架功能而不进入 Li⁺ 溶剂化鞘，从根本上回避瓶颈①；同时利用氟化弱溶剂化液相与双盐在原位聚合贴合的界面上协同成膜，针对瓶颈②。该工作有望：(a) 为"非均相准固态电解质"提供可控制备方法与构效关系；(b) 将液态弱溶剂化/氟化电解液的高压优势"原汁原味"地移植到准固态体系；(c) 为高安全、高电压锂电池提供一种原位聚合、工艺兼容的电解质方案。</w:t>
+        <w:t xml:space="preserve"> 本课题选择与溶剂 DMTFA 同为酰胺结构的 MBA 构建交联网络，使弱溶剂化电解液在凝胶化后仍保持其溶剂化结构与电导率，并利用酰胺基团的氢键作用调控阴离子以提高迁移数；同时借助双盐与氟化溶剂在原位聚合贴合的界面上构筑稳定的 SEI/CEI。该工作有望：(a) 为"凝胶化不牺牲液态电解液溶剂化优势"提供一种基于酰胺网络的实现路径；(b) 阐明骨架氢键作用调控阴离子、提升迁移数的机理；(c) 为 4.5 V 高镍锂金属电池提供一种原位聚合、工艺兼容的高安全电解质方案。</w:t>
       </w:r>
     </w:p>
     <w:p>
@@ -230,7 +212,7 @@
         <w:t>3.1 凝胶聚合物电解质与原位聚合。</w:t>
       </w:r>
       <w:r>
-        <w:t xml:space="preserve"> GPE 的制备分为预制多孔膜溶胀法与原位聚合法两类；原位聚合将低黏度前驱液注入电池后热/光引发固化，可充分浸润多孔电极、降低界面阻抗，是近年研究热点[1,2]。常用单体/骨架包括 PEGDA、PEO 衍生物、PVDF-HFP、聚碳酸酯、1,3-二氧戊环（DOL）开环聚合物等[1,2,14]。这些体系大多追求均相透明的凝胶，设计逻辑是"聚合物与液相高度相容"，但相容的代价是聚合物基团参与 Li⁺ 配位、液相被稀释，凝胶化后电导率普遍下降 1 个数量级左右。</w:t>
+        <w:t xml:space="preserve"> GPE 的制备分为预制多孔膜溶胀法与原位聚合法；原位聚合将低黏度前驱液注入电池后热/光引发固化，可充分浸润多孔电极、降低界面阻抗，是近年研究热点[1,2]。常用单体/骨架包括 PEGDA、PEO 衍生物、PVDF-HFP、聚碳酸酯、DOL 开环聚合物等[1,2,14]。这些体系大多以聚醚或聚酯为骨架，其极性基团对 Li⁺ 配位能力强，凝胶化后电导率普遍下降约 1 个数量级，且液相原有的溶剂化结构被改写。</w:t>
       </w:r>
     </w:p>
     <w:p>
@@ -246,13 +228,13 @@
         <w:t>3.2 弱溶剂化、局部高浓与氟化电解液。</w:t>
       </w:r>
       <w:r>
-        <w:t xml:space="preserve"> Zhang 等提出的 LHCE 以 TTE、BTFE 等弱配位氟醚稀释高浓电解液，在降低黏度的同时保留阴离子富集的溶剂化结构，显著提升锂金属库仑效率和高压稳定性[3,4,15]；Yao 等进一步提出"弱溶剂化电解液"概念，通过削弱溶剂–Li⁺ 作用使阴离子进入溶剂化鞘，形成无机物富集的界面膜[5]。DMTFA 作为 α-氟化酰胺溶剂，兼具高极性（溶盐能力）与弱 Li⁺ 配位（–CF₃ 拉电子），氧化窗口 &gt;5 V，早期作为 Li–O₂ 电池添加剂被证明可在锂金属上生成 LiF 富集 SEI[6]，随后被用于 NCM523 高压添加剂[7]，近期已作为主溶剂用于 NCM91 高压锂金属电池，被认为打破了"极性–配位耦合"[8]。</w:t>
+        <w:t xml:space="preserve"> 以 TTE、BTFE 等弱配位氟醚稀释高浓电解液形成的 LHCE，在降低黏度的同时保留阴离子富集的溶剂化结构，显著提升锂金属库仑效率和高压稳定性[3,4,15]；"弱溶剂化电解液"通过削弱溶剂–Li⁺ 作用使阴离子进入溶剂化鞘，形成无机物富集的界面膜[5]。DMTFA 作为 α-氟化酰胺溶剂，兼具高极性与弱 Li⁺ 配位（–CF₃ 拉电子），氧化窗口 &gt;5 V，早期作为添加剂被证明可在锂金属上生成 LiF 富集 SEI[6]，随后用于 NCM523 高压添加剂[7]，近期已作为主溶剂用于 NCM91 高压锂金属电池[8]。</w:t>
       </w:r>
       <w:r>
         <w:rPr>
           <w:b/>
         </w:rPr>
-        <w:t>但上述工作全部为液态体系，DMTFA/TTE 基电解液的凝胶化/准固态化尚未见报道。</w:t>
+        <w:t>上述工作均为液态体系，DMTFA/TTE 基电解液的凝胶化尚未见报道。</w:t>
       </w:r>
       <w:r/>
     </w:p>
@@ -266,11 +248,18 @@
         <w:rPr>
           <w:b/>
         </w:rPr>
-        <w:t>3.3 双盐与界面成膜。</w:t>
+        <w:t>3.3 凝胶化过程中溶剂化结构的保留。</w:t>
       </w:r>
       <w:r>
-        <w:t xml:space="preserve"> LiDFOB 兼具氧化与还原活性，可在正极优先氧化、在负极优先还原，生成含 LiF、B–O 物种的无机富集 CEI/SEI，抑制过渡金属溶出并钝化高压正极表面[9,10]；LiDFOB 基双盐电解液在无负极软包电池中实现了致密锂沉积与长循环[11]。在弱溶剂化环境中阴离子更易进入溶剂化鞘，DFOB⁻ 的成膜作用有望被放大，但其在氟化酰胺/氟醚体系及准固态体系中的作用尚不清楚。</w:t>
+        <w:t xml:space="preserve"> 近期研究开始关注"聚合物网络引入是否改变 LHCE 溶剂化结构"这一问题：Adv. Mater. 2026 通过在 DME 基 LHCE 中原位聚合对 Li⁺ 配位能力有限的氟化聚合物，基本保留了局部高浓溶剂化环境[16]；Energy Environ. Sci. 2025 以 –CF₃ 修饰的氟化聚合物骨架作为"伪稀释剂"调控高浓醚电解液的溶剂化结构[17]。这些工作均依赖氟化聚合物的弱配位特性；</w:t>
       </w:r>
+      <w:r>
+        <w:rPr>
+          <w:b/>
+        </w:rPr>
+        <w:t>以非氟化酰胺网络实现溶剂化结构保留、并同时利用骨架氢键供体调控阴离子的研究尚未见报道。</w:t>
+      </w:r>
+      <w:r/>
     </w:p>
     <w:p>
       <w:pPr>
@@ -282,18 +271,11 @@
         <w:rPr>
           <w:b/>
         </w:rPr>
-        <w:t>3.4 聚合诱导相分离（PIPS）在电池中的应用。</w:t>
+        <w:t>3.4 双盐与界面成膜。</w:t>
       </w:r>
       <w:r>
-        <w:t xml:space="preserve"> PIPS 在多孔膜、结构电池电解质领域已有应用：以多官能单体与液态电解液组分一步法制备微孔隔膜[12]，或构建双连续"固–液两相"结构电池电解质并保持低温离子传导[13]。这些工作表明"非均相"结构可同时提供力学骨架与连续液相传输通道。</w:t>
+        <w:t xml:space="preserve"> LiDFOB 兼具氧化与还原活性，可在正极优先氧化、在负极优先还原，生成含 LiF、B–O 物种的无机富集 CEI/SEI，抑制过渡金属溶出并钝化高压正极表面[9,10]；LiDFOB 基双盐电解液在无负极软包电池中实现了致密锂沉积与长循环[11]。在弱溶剂化环境中阴离子更易进入溶剂化鞘，DFOB⁻ 的成膜作用有望被放大，但其在氟化酰胺/氟醚凝胶体系中的作用尚不清楚。</w:t>
       </w:r>
-      <w:r>
-        <w:rPr>
-          <w:b/>
-        </w:rPr>
-        <w:t>然而在原位聚合 GPE 领域，相分离与发白通常被视为失败而被回避，尚缺乏将 PIPS 作为主动设计变量、建立"相分离时机—骨架形貌—电化学性能"定量关系的研究；MBA 作为唯一网络单体构筑电解质骨架亦未见报道。</w:t>
-      </w:r>
-      <w:r/>
     </w:p>
     <w:p>
       <w:pPr>
@@ -308,7 +290,7 @@
         <w:t>3.5 小结与切入点。</w:t>
       </w:r>
       <w:r>
-        <w:t xml:space="preserve"> 综上，(i) 弱溶剂化/氟化液态电解液成果丰富，但其准固态化是空白；(ii) 均相 GPE 的"聚合物参与配位"瓶颈未被根本解决；(iii) PIPS 在原位聚合电解质中的设计潜力尚未被挖掘；(iv) 双盐在弱溶剂化准固态体系中的成膜机制不清。本课题以 MBA/DMTFA–TTE/LiPF₆–LiDFOB 体系为对象，正是针对上述四个空白。</w:t>
+        <w:t xml:space="preserve"> 综上，(i) 弱溶剂化/氟化液态电解液成果丰富，但其凝胶化是空白；(ii) 均相 GPE"聚合物参与配位、溶剂化结构被改写"的瓶颈未被根本解决，现有解决思路局限于氟化聚合物；(iii) 利用骨架氢键供体调控阴离子以提升迁移数的路径尚缺系统研究；(iv) 双盐在弱溶剂化凝胶体系中的界面成膜机制不清。本课题以 MBA/DMTFA–TTE/LiPF₆–LiDFOB 体系为对象，正是针对上述空白。</w:t>
       </w:r>
     </w:p>
     <w:p>
@@ -442,7 +424,7 @@
         <w:ind w:firstLine="0"/>
       </w:pPr>
       <w:r>
-        <w:t xml:space="preserve">[7] Amide compounds as electrolyte additives for improving the performance of high-voltage lithium-ion batteries (DMTFA/DMAA, NCM523/graphite, 3–4.6 V). </w:t>
+        <w:t xml:space="preserve">[7] Amide compounds as electrolyte additives for improving the performance of high-voltage lithium-ion batteries. </w:t>
       </w:r>
       <w:r>
         <w:rPr>
@@ -460,7 +442,7 @@
         <w:ind w:firstLine="0"/>
       </w:pPr>
       <w:r>
-        <w:t xml:space="preserve">[8] Li et al. Breaking the Polarity–Coordination Coupling in Electrolyte Design for High-Voltage Lithium Batteries (DMTFA 主溶剂, NCM91). </w:t>
+        <w:t xml:space="preserve">[8] Li et al. Breaking the Polarity–Coordination Coupling in Electrolyte Design for High-Voltage Lithium Batteries. </w:t>
       </w:r>
       <w:r>
         <w:rPr>
@@ -532,7 +514,7 @@
         <w:ind w:firstLine="0"/>
       </w:pPr>
       <w:r>
-        <w:t xml:space="preserve">[12] One-step fabrication of robust lithium ion battery separators by polymerization-induced phase separation (pBDDA/EC). </w:t>
+        <w:t xml:space="preserve">[12] One-step fabrication of robust lithium ion battery separators by polymerization-induced phase separation. </w:t>
       </w:r>
       <w:r>
         <w:rPr>
@@ -541,7 +523,7 @@
         <w:t>J. Mater. Chem. A</w:t>
       </w:r>
       <w:r>
-        <w:t>, 2022. (OSTI 1982228)</w:t>
+        <w:t>, 2022.</w:t>
       </w:r>
     </w:p>
     <w:p>
@@ -604,7 +586,43 @@
         <w:ind w:firstLine="0"/>
       </w:pPr>
       <w:r>
-        <w:t>【16–20：课题组相关论文、导师前期工作】</w:t>
+        <w:t xml:space="preserve">[16] Xu et al. Solvation-Preserving Gelation of Localized High-Concentration Electrolytes for Lithium Metal Batteries. </w:t>
+      </w:r>
+      <w:r>
+        <w:rPr>
+          <w:i/>
+        </w:rPr>
+        <w:t>Adv. Mater.</w:t>
+      </w:r>
+      <w:r>
+        <w:t>, 2026. DOI: 10.1002/adma.74634</w:t>
+      </w:r>
+    </w:p>
+    <w:p>
+      <w:pPr>
+        <w:spacing w:line="336" w:lineRule="auto"/>
+        <w:ind w:firstLine="0"/>
+      </w:pPr>
+      <w:r>
+        <w:t xml:space="preserve">[17] Toward practical lithium metal batteries via a solvation structure regulation strategy in in situ polymerized fluorinated gel polymer electrolytes. </w:t>
+      </w:r>
+      <w:r>
+        <w:rPr>
+          <w:i/>
+        </w:rPr>
+        <w:t>Energy Environ. Sci.</w:t>
+      </w:r>
+      <w:r>
+        <w:t>, 2025. DOI: 10.1039/d5ee03662c</w:t>
+      </w:r>
+    </w:p>
+    <w:p>
+      <w:pPr>
+        <w:spacing w:line="336" w:lineRule="auto"/>
+        <w:ind w:firstLine="0"/>
+      </w:pPr>
+      <w:r>
+        <w:t>【18–20：课题组相关论文、导师前期工作】</w:t>
       </w:r>
     </w:p>
     <w:p>
@@ -637,7 +655,7 @@
         <w:ind w:firstLine="454"/>
       </w:pPr>
       <w:r>
-        <w:t>（1）阐明 MBA 在氟化弱溶剂化液相中聚合诱导相分离的发生条件与骨架形成机制，证明"酰胺骨架—连续液相"空间解耦是其性能优于均相凝胶的根源；</w:t>
+        <w:t>（1）阐明 MBA 酰胺网络与 DMTFA/TTE 弱溶剂化液相的相互作用方式，证明凝胶化前后 Li⁺ 溶剂化结构与传输机制的一致性，并与聚醚（PEGDA）网络对比揭示骨架化学的作用；</w:t>
       </w:r>
     </w:p>
     <w:p>
@@ -646,7 +664,7 @@
         <w:ind w:firstLine="454"/>
       </w:pPr>
       <w:r>
-        <w:t>（2）建立"聚合条件 → 相分离时机 → 骨架形貌 → 保液/力学/传输/界面性能"的定量构效关系，确定最优形貌窗口；</w:t>
+        <w:t>（2）揭示酰胺 N–H 氢键作用对 PF₆⁻/DFOB⁻ 阴离子的调控及其对 Li⁺ 迁移数提升的贡献；</w:t>
       </w:r>
     </w:p>
     <w:p>
@@ -655,7 +673,7 @@
         <w:ind w:firstLine="454"/>
       </w:pPr>
       <w:r>
-        <w:t>（3）证明氟化弱溶剂化液相的溶剂化结构、氧化窗口与脱溶剂化动力学在准固态化后得以保留；</w:t>
+        <w:t>（3）阐明 LiPF₆/LiDFOB 双盐、氟化溶剂与酰胺网络在凝胶中形成 SEI/CEI 的组分来源与稳定机制；</w:t>
       </w:r>
     </w:p>
     <w:p>
@@ -664,16 +682,7 @@
         <w:ind w:firstLine="454"/>
       </w:pPr>
       <w:r>
-        <w:t>（4）揭示 LiDFOB/氟化溶剂/酰胺骨架三源协同的正负极界面成膜化学；</w:t>
-      </w:r>
-    </w:p>
-    <w:p>
-      <w:pPr>
-        <w:spacing w:line="336" w:lineRule="auto"/>
-        <w:ind w:firstLine="454"/>
-      </w:pPr>
-      <w:r>
-        <w:t>（5）在【NCM811 / 4.5 V】‖【Li / 石墨】全电池中实现【目标：室温 1C 循环 ≥300 周、容量保持率 ≥80%；自熄、不漏液】（指标按预实验调整）。</w:t>
+        <w:t>（4）在 Li‖NCM811 全电池中实现 4.5 V 下 1C/3C 稳定循环【目标：1C ≥【300】周、容量保持率 ≥【80】%；3C ≥【200】周】，并具备阻燃、不漏液特性。</w:t>
       </w:r>
     </w:p>
     <w:p>
@@ -694,7 +703,7 @@
         <w:rPr>
           <w:b/>
         </w:rPr>
-        <w:t>内容一：PIPS 型准固态电解质的构筑与骨架形成机制。</w:t>
+        <w:t>内容一：凝胶电解质的构筑及网络–液相相互作用。</w:t>
       </w:r>
       <w:r/>
     </w:p>
@@ -704,7 +713,7 @@
         <w:ind w:firstLine="454"/>
       </w:pPr>
       <w:r>
-        <w:t>测定 MBA 在 DMTFA、TTE 及其混合溶剂中的溶解度与前驱液状态（真溶液/悬浮）；考察聚合过程中的相分离行为；通过液相抽提获得干骨架，表征颗粒尺寸、连通性、比表面积；与同液相的 PEGDA 均相凝胶（C1）、纯液态（C0）系统对比，建立"相分离 → 解耦"的机理证据链。</w:t>
+        <w:t>优化 MBA 含量、引发剂与聚合条件；FTIR/Raman 确认聚合转化率；测定保液率、热稳定性与阻燃性；通过 FTIR（酰胺 I/II、N–H、DMTFA C=O）、DFT 计算分析酰胺网络与溶剂、阴离子的氢键/配位作用；SEM、DSC 表征网络形貌及液相状态（前期观察到 MBA 凝胶为非均相白色结构，PEGDA 凝胶为均相透明结构，将作为结构差异纳入分析）。</w:t>
       </w:r>
     </w:p>
     <w:p>
@@ -717,7 +726,7 @@
         <w:rPr>
           <w:b/>
         </w:rPr>
-        <w:t>内容二：相分离程度调控与构效关系。</w:t>
+        <w:t>内容二：凝胶化前后 Li⁺ 溶剂化结构与传输机制。</w:t>
       </w:r>
       <w:r/>
     </w:p>
@@ -727,7 +736,7 @@
         <w:ind w:firstLine="454"/>
       </w:pPr>
       <w:r>
-        <w:t>以 MBA 浓度（如 3/5/8/12 wt%）、DMTFA : TTE 体积比（3:1、1:1、1:3）、聚合温度与引发剂用量为变量，原位跟踪相分离时机（透光率/散射随聚合时间与转化率的关系），统计骨架形貌参数，系统测量保液率、流变屈服应力、离子电导率、Li⁺ 迁移数及界面阻抗演化，绘制"形貌参数—性能"权衡图；通过同成分液态系列扣除液相自身变化，分离形貌效应与溶剂化效应。</w:t>
+        <w:t>以液态电解液（C0）和同液相 PEGDA 凝胶（C1）为对照，采用 Raman（PF₆⁻ 740 cm⁻¹ 区 SSIP/CIP/AGG 分布、DMTFA C=O 配位状态）、⁷Li/¹⁹F/¹¹B NMR 对比溶剂化鞘组成；PFG-NMR 测定 Li⁺ 与阴离子自扩散系数；变温 EIS 获得体相与界面活化能；Bruce–Vincent 法测定迁移数；结合 MD 模拟分析酰胺位点是否进入 Li⁺ 第一溶剂化鞘及 N–H 与阴离子的氢键寿命，阐明"高电导率与高迁移数兼得"的机理。</w:t>
       </w:r>
     </w:p>
     <w:p>
@@ -740,7 +749,7 @@
         <w:rPr>
           <w:b/>
         </w:rPr>
-        <w:t>内容三：准固态化前后 Li⁺ 溶剂化结构与传输机制。</w:t>
+        <w:t>内容三：双界面化学组成与稳定机制。</w:t>
       </w:r>
       <w:r/>
     </w:p>
@@ -750,7 +759,7 @@
         <w:ind w:firstLine="454"/>
       </w:pPr>
       <w:r>
-        <w:t>采用 Raman、FTIR、⁷Li/¹⁹F NMR 对比液态与准固态中 PF₆⁻ 的 SSIP/CIP/AGG 分布与 DMTFA 配位状态；PFG-NMR 测定 Li⁺、阴离子自扩散系数；变温 EIS 获得体相与界面活化能；LSV 与恒压浮充评价氧化窗口；结合 MD/DFT 分析酰胺基团是否参与配位及骨架表面 N–H 与阴离子的氢键作用。</w:t>
+        <w:t>以 C0、C1、无 LiDFOB 凝胶（C3）为对照，用 XPS 深度剖析、TOF-SIMS 分析循环后 Li 负极与 NCM811 正极界面膜中 LiF、B–O、含 N 物种的来源；Li‖Cu 库仑效率、Li‖Li 长循环及 EIS/DRT 演化评价 SEI 稳定性；TEM、ICP-OES 分析 CEI 厚度与过渡金属溶出；LSV 与恒压浮充评价高压稳定性。</w:t>
       </w:r>
     </w:p>
     <w:p>
@@ -763,7 +772,7 @@
         <w:rPr>
           <w:b/>
         </w:rPr>
-        <w:t>内容四：三源协同界面化学与全电池验证。</w:t>
+        <w:t>内容四：全电池性能与安全性验证。</w:t>
       </w:r>
       <w:r/>
     </w:p>
@@ -773,7 +782,7 @@
         <w:ind w:firstLine="454"/>
       </w:pPr>
       <w:r>
-        <w:t>以 C0（液态）、C2（MBA + 碳酸酯液相）、C3（无 LiDFOB）为对照，用 XPS 深度剖析、TOF-SIMS 逐一归因 SEI/CEI 中 B–O、LiF、含 N 物种的来源；Li‖Cu 库仑效率、Li‖Li 长循环与 EIS/DRT 演化评价界面稳定性；TEM/ICP 分析 CEI 厚度与过渡金属溶出；组装全电池进行循环、倍率、高低温与安全（自熄时间、与脱锂正极共存 DSC）测试，并在循环后拆解回溯界面组分。</w:t>
+        <w:t>Li‖NCM811 在 4.5 V 下的 1C/3C 长循环、倍率、高低温性能；循环后拆解回溯界面组分；自熄时间、与脱锂 NCM811 共存 DSC 等安全性评价；软包电池初步验证。</w:t>
       </w:r>
     </w:p>
     <w:p>
@@ -790,16 +799,7 @@
         <w:ind w:firstLine="454"/>
       </w:pPr>
       <w:r>
-        <w:t>（1）</w:t>
-      </w:r>
-      <w:r>
-        <w:rPr>
-          <w:b/>
-        </w:rPr>
-        <w:t>相分离与解耦的因果关系</w:t>
-      </w:r>
-      <w:r>
-        <w:t>：如何证明聚合物以独立颗粒相存在、未进入 Li⁺ 溶剂化鞘，而非"液态 + 惰性粉末"的简单叠加？</w:t>
+        <w:t>（1）酰胺网络如何在不改变弱溶剂化结构的前提下实现凝胶化？酰胺 C=O 与 N–H 分别与 Li⁺、溶剂、阴离子发生何种作用？</w:t>
       </w:r>
     </w:p>
     <w:p>
@@ -808,16 +808,7 @@
         <w:ind w:firstLine="454"/>
       </w:pPr>
       <w:r>
-        <w:t>（2）</w:t>
-      </w:r>
-      <w:r>
-        <w:rPr>
-          <w:b/>
-        </w:rPr>
-        <w:t>相分离的可控性</w:t>
-      </w:r>
-      <w:r>
-        <w:t>：TTE 比例同时改变相分离时机与溶剂化结构，如何在实验上分离两种效应？</w:t>
+        <w:t>（2）迁移数提高源于骨架对阴离子的氢键束缚还是其他因素？如何通过 ¹⁹F NMR、PFG 与计算予以区分？</w:t>
       </w:r>
     </w:p>
     <w:p>
@@ -826,34 +817,7 @@
         <w:ind w:firstLine="454"/>
       </w:pPr>
       <w:r>
-        <w:t>（3）</w:t>
-      </w:r>
-      <w:r>
-        <w:rPr>
-          <w:b/>
-        </w:rPr>
-        <w:t>非整体骨架的锁液与器件化</w:t>
-      </w:r>
-      <w:r>
-        <w:t>：颗粒骨架如何在不自支撑的前提下实现可靠锁液，并以"原位聚合复合隔膜"形式进入电池？</w:t>
-      </w:r>
-    </w:p>
-    <w:p>
-      <w:pPr>
-        <w:spacing w:line="336" w:lineRule="auto"/>
-        <w:ind w:firstLine="454"/>
-      </w:pPr>
-      <w:r>
-        <w:t>（4）</w:t>
-      </w:r>
-      <w:r>
-        <w:rPr>
-          <w:b/>
-        </w:rPr>
-        <w:t>界面组分的来源归因</w:t>
-      </w:r>
-      <w:r>
-        <w:t>：如何用对照实验而非相关性证明 B–O、LiF、含 N 物种分别来自 LiDFOB、氟化溶剂与骨架？</w:t>
+        <w:t>（3）凝胶中阴离子衍生界面膜是否得以保留，骨架是否参与成膜？如何用对照实验实现组分来源归因？</w:t>
       </w:r>
     </w:p>
     <w:p>
@@ -884,7 +848,7 @@
         <w:t>材料制备</w:t>
       </w:r>
       <w:r>
-        <w:t>：手套箱内配制前驱液（MBA、液态电解液、热引发剂 AIBN 或光引发剂），注入含隔膜/电极的电池后在【60–80 °C】热引发或 UV 固化；液相以 DMC 抽提获得干骨架。</w:t>
+        <w:t>：手套箱内配制前驱液（MBA、液态电解液、热引发剂 AIBN），注入含隔膜与电极的电池后【60–80 °C】热引发聚合。</w:t>
       </w:r>
     </w:p>
     <w:p>
@@ -896,10 +860,10 @@
         <w:rPr>
           <w:b/>
         </w:rPr>
-        <w:t>结构表征</w:t>
+        <w:t>结构与相互作用表征</w:t>
       </w:r>
       <w:r>
-        <w:t>：偏光显微镜与浊度（前驱液）、原位透光率（相分离时机）、SEM/冷冻断面 SEM/BET（骨架形貌）、FTIR/Raman（转化率、C=C 消失；酰胺 I/II、N–H、C=O 配位）、SAXS（网络尺度）、DSC/TGA（液相 Tg、热稳定）。</w:t>
+        <w:t>：FTIR/Raman、SEM、DSC/TGA、保液率、流变、DFT 结合能计算。</w:t>
       </w:r>
     </w:p>
     <w:p>
@@ -914,7 +878,7 @@
         <w:t>溶剂化与传输</w:t>
       </w:r>
       <w:r>
-        <w:t>：Raman 去卷积、⁷Li/¹⁹F/¹¹B NMR、PFG-NMR、变温 EIS（Arrhenius/VTF）、Bruce–Vincent 迁移数、DRT 分峰、LSV 与浮充漏电流、MD/DFT。</w:t>
+        <w:t>：Raman 去卷积、⁷Li/¹⁹F/¹¹B NMR、PFG-NMR、变温 EIS（Arrhenius/VTF）、Bruce–Vincent 迁移数、DRT、LSV 与浮充漏电流、MD 模拟。</w:t>
       </w:r>
     </w:p>
     <w:p>
@@ -929,7 +893,7 @@
         <w:t>界面与器件</w:t>
       </w:r>
       <w:r>
-        <w:t>：XPS 深度剖析、TOF-SIMS、SEM/TEM、ICP-OES、Li‖Cu/Li‖Li/全电池电化学测试、自熄时间与 DSC 安全测试。</w:t>
+        <w:t>：XPS 深度剖析、TOF-SIMS、SEM/TEM、ICP-OES、Li‖Cu/Li‖Li/Li‖NCM811 电化学测试、自熄时间与 DSC 安全测试。</w:t>
       </w:r>
     </w:p>
     <w:p>
@@ -946,25 +910,27 @@
           <w:rFonts w:ascii="Consolas" w:hAnsi="Consolas"/>
           <w:sz w:val="18"/>
         </w:rPr>
-        <w:t>液态基准 C0 ──► MBA 原位聚合 ──► PIPS 骨架 + 连续液相（S）</w:t>
+        <w:t>液态电解液 C0 ──► MBA 原位聚合 ──► 酰胺网络凝胶电解质 S</w:t>
         <w:br/>
-        <w:t xml:space="preserve">   │                │                     │</w:t>
+        <w:t xml:space="preserve">   │                  │</w:t>
         <w:br/>
-        <w:t xml:space="preserve">   │           PEGDA 对照 C1          形貌梯度系列（内容二）</w:t>
+        <w:t xml:space="preserve">   │             PEGDA 对照 C1 / 无 LiDFOB 对照 C3</w:t>
         <w:br/>
-        <w:t xml:space="preserve">   │           碳酸酯对照 C2                │</w:t>
+        <w:t xml:space="preserve">   ▼                  ▼</w:t>
         <w:br/>
-        <w:t xml:space="preserve">   │           无 LiDFOB 对照 C3            │</w:t>
+        <w:t xml:space="preserve"> 内容一：网络–液相相互作用（FTIR/DFT/形貌）</w:t>
         <w:br/>
-        <w:t xml:space="preserve">   ▼                ▼                     ▼</w:t>
+        <w:t xml:space="preserve">   ▼</w:t>
         <w:br/>
-        <w:t xml:space="preserve"> 溶剂化/传输（内容三）◄── 解耦机理（内容一）──► 构效关系</w:t>
+        <w:t xml:space="preserve"> 内容二：溶剂化结构与传输（Raman/NMR/PFG/EIS/MD）</w:t>
         <w:br/>
-        <w:t xml:space="preserve">                    │</w:t>
+        <w:t xml:space="preserve">   ▼</w:t>
         <w:br/>
-        <w:t xml:space="preserve">                    ▼</w:t>
+        <w:t xml:space="preserve"> 内容三：双界面化学（XPS/TOF-SIMS/Li‖Li/Li‖Cu）</w:t>
         <w:br/>
-        <w:t xml:space="preserve">           三源界面化学（内容四）──► 全电池 / 安全验证 ──► 循环后回溯</w:t>
+        <w:t xml:space="preserve">   ▼</w:t>
+        <w:br/>
+        <w:t xml:space="preserve"> 内容四：Li‖NCM811 4.5 V 1C/3C 全电池 + 安全性 ──► 循环后回溯</w:t>
       </w:r>
     </w:p>
     <w:p>
@@ -1099,7 +1065,7 @@
               <w:rPr>
                 <w:sz w:val="21"/>
               </w:rPr>
-              <w:t>准固态化代价、溶剂化基线</w:t>
+              <w:t>凝胶化代价、溶剂化基线</w:t>
             </w:r>
           </w:p>
         </w:tc>
@@ -1155,63 +1121,7 @@
               <w:rPr>
                 <w:sz w:val="21"/>
               </w:rPr>
-              <w:t>均相溶胀 vs 相分离解耦</w:t>
-            </w:r>
-          </w:p>
-        </w:tc>
-      </w:tr>
-      <w:tr>
-        <w:tc>
-          <w:tcPr>
-            <w:tcW w:type="dxa" w:w="3135"/>
-          </w:tcPr>
-          <w:p>
-            <w:r>
-              <w:rPr>
-                <w:sz w:val="21"/>
-              </w:rPr>
-            </w:r>
-            <w:r>
-              <w:rPr>
-                <w:sz w:val="21"/>
-              </w:rPr>
-              <w:t>C2</w:t>
-            </w:r>
-          </w:p>
-        </w:tc>
-        <w:tc>
-          <w:tcPr>
-            <w:tcW w:type="dxa" w:w="3135"/>
-          </w:tcPr>
-          <w:p>
-            <w:r>
-              <w:rPr>
-                <w:sz w:val="21"/>
-              </w:rPr>
-            </w:r>
-            <w:r>
-              <w:rPr>
-                <w:sz w:val="21"/>
-              </w:rPr>
-              <w:t>MBA + 1 M LiPF₆ / EC:DMC</w:t>
-            </w:r>
-          </w:p>
-        </w:tc>
-        <w:tc>
-          <w:tcPr>
-            <w:tcW w:type="dxa" w:w="3135"/>
-          </w:tcPr>
-          <w:p>
-            <w:r>
-              <w:rPr>
-                <w:sz w:val="21"/>
-              </w:rPr>
-            </w:r>
-            <w:r>
-              <w:rPr>
-                <w:sz w:val="21"/>
-              </w:rPr>
-              <w:t>氟化弱溶剂化液相是否必要；LiF 来源</w:t>
+              <w:t>聚醚 vs 酰胺骨架</w:t>
             </w:r>
           </w:p>
         </w:tc>
@@ -1267,7 +1177,7 @@
               <w:rPr>
                 <w:sz w:val="21"/>
               </w:rPr>
-              <w:t>B–O 来源、双盐贡献</w:t>
+              <w:t>DFOB⁻ 对界面的贡献</w:t>
             </w:r>
           </w:p>
         </w:tc>
@@ -1328,62 +1238,6 @@
           </w:p>
         </w:tc>
       </w:tr>
-      <w:tr>
-        <w:tc>
-          <w:tcPr>
-            <w:tcW w:type="dxa" w:w="3135"/>
-          </w:tcPr>
-          <w:p>
-            <w:r>
-              <w:rPr>
-                <w:sz w:val="21"/>
-              </w:rPr>
-            </w:r>
-            <w:r>
-              <w:rPr>
-                <w:sz w:val="21"/>
-              </w:rPr>
-              <w:t>S-x</w:t>
-            </w:r>
-          </w:p>
-        </w:tc>
-        <w:tc>
-          <w:tcPr>
-            <w:tcW w:type="dxa" w:w="3135"/>
-          </w:tcPr>
-          <w:p>
-            <w:r>
-              <w:rPr>
-                <w:sz w:val="21"/>
-              </w:rPr>
-            </w:r>
-            <w:r>
-              <w:rPr>
-                <w:sz w:val="21"/>
-              </w:rPr>
-              <w:t>S 的形貌梯度系列（MBA 浓度、溶剂比、温度）</w:t>
-            </w:r>
-          </w:p>
-        </w:tc>
-        <w:tc>
-          <w:tcPr>
-            <w:tcW w:type="dxa" w:w="3135"/>
-          </w:tcPr>
-          <w:p>
-            <w:r>
-              <w:rPr>
-                <w:sz w:val="21"/>
-              </w:rPr>
-            </w:r>
-            <w:r>
-              <w:rPr>
-                <w:sz w:val="21"/>
-              </w:rPr>
-              <w:t>构效关系</w:t>
-            </w:r>
-          </w:p>
-        </w:tc>
-      </w:tr>
     </w:tbl>
     <w:p/>
     <w:p>
@@ -1399,7 +1253,7 @@
         <w:t>关键判据</w:t>
       </w:r>
       <w:r>
-        <w:t>：同一张谱图中 S 与 C0 重叠而 C1 偏离（Raman 740 cm⁻¹、⁷Li NMR、DSC 液相 Tg、PFG D_Li），即为解耦的直接证据；去掉某一组分后对应界面物种消失，即为归因证据。</w:t>
+        <w:t>：同一张谱图中 S 与 C0 重叠而 C1 偏离（Raman、⁷Li NMR、PFG D_Li），即为溶剂化结构保留的证据；去掉 LiDFOB 后 B–O 物种消失，即为界面归因证据。</w:t>
       </w:r>
     </w:p>
     <w:p>
@@ -1425,7 +1279,7 @@
         <w:t>原理可行</w:t>
       </w:r>
       <w:r>
-        <w:t>：DMTFA 弱配位、高氧化稳定[6–8]，TTE 稀释[3,15]，LiDFOB 双界面成膜[9–11]，PIPS 构筑固–液两相电解质[12,13] 均有独立文献支撑；本课题是其有逻辑的组合与机理深化。</w:t>
+        <w:t>：DMTFA 弱配位、高氧化稳定[6–8]，TTE 稀释[3,15]，LiDFOB 双界面成膜[9–11]，凝胶化保留溶剂化结构[16,17] 均有文献支撑。</w:t>
       </w:r>
     </w:p>
     <w:p>
@@ -1443,7 +1297,7 @@
         <w:t>前期结果支持</w:t>
       </w:r>
       <w:r>
-        <w:t>：已实现 MBA 体系的原位聚合，并观察到其性能优于同液相 PEGDA 凝胶【补充具体数据：电导率、循环】，为核心假设提供了初步证据。</w:t>
+        <w:t>：已完成 S、C0、C1 的 Raman、⁷Li NMR、FTIR、离子电导率、迁移数、LSV、Li‖Li 对称循环以及 Li‖NCM811 4.5 V 1C/3C 循环测试，初步结果与研究假设一致（详见第三部分）。</w:t>
       </w:r>
     </w:p>
     <w:p>
@@ -1461,7 +1315,7 @@
         <w:t>条件可行</w:t>
       </w:r>
       <w:r>
-        <w:t>：所需单体、盐、溶剂均为商品化试剂；课题组具备手套箱、电化学工作站、电池测试系统及常规结构表征条件【详见第三部分】。</w:t>
+        <w:t>：所需试剂均为商品化产品；课题组具备原位聚合、电化学测试与常规表征条件。</w:t>
       </w:r>
     </w:p>
     <w:p>
@@ -1479,7 +1333,7 @@
         <w:t>风险与预案</w:t>
       </w:r>
       <w:r>
-        <w:t>：若 DMTFA 在负极侧还原不稳定，则通过提高 LiDFOB 比例或引入少量 FEC 调控 SEI；若颗粒骨架锁液不足，则以提高 MBA 浓度或改变溶剂比细化骨架，并以隔膜/极片孔隙内原位聚合保证器件化。</w:t>
+        <w:t>：若 ¹⁹F/PFG 结果不支持"N–H 束缚阴离子"，则从网络形貌（非均相结构、液相连续性）角度解释迁移数差异；若 DMTFA 在负极侧长期稳定性不足，则调整 LiDFOB 比例或引入少量 FEC。</w:t>
       </w:r>
     </w:p>
     <w:p>
@@ -1502,10 +1356,10 @@
         <w:rPr>
           <w:b/>
         </w:rPr>
-        <w:t>相分离解耦型骨架</w:t>
+        <w:t>构建了酰胺交联网络/氟化弱溶剂化电解液（DMTFA/TTE）原位凝胶电解质，凝胶化后保持液态的 Li⁺ 溶剂化结构和离子电导率。</w:t>
       </w:r>
       <w:r>
-        <w:t>：首次利用 MBA 在氟化弱溶剂化液相中的聚合诱导相分离，构筑"刚性酰胺微颗粒骨架 + 连续液相"的非均相准固态电解质，实现聚合物骨架与 Li⁺ 传输通道的空间解耦，从根本上回避均相溶胀型凝胶"聚合物配位 Li⁺ → 电导率/迁移数下降"的共性瓶颈。</w:t>
+        <w:t xml:space="preserve"> 现有"溶剂化保留"策略依赖氟化聚合物的弱配位；本工作以非氟化酰胺网络实现同样目标，拉曼与 ⁷Li NMR 显示凝胶与液态一致，电导率接近液态并优于 PEGDA 凝胶。</w:t>
       </w:r>
     </w:p>
     <w:p>
@@ -1520,10 +1374,10 @@
         <w:rPr>
           <w:b/>
         </w:rPr>
-        <w:t>将相分离从缺陷转化为设计变量</w:t>
+        <w:t>利用酰胺基团的氢键作用调控阴离子，在不牺牲电导率的前提下提高了 Li⁺ 迁移数。</w:t>
       </w:r>
       <w:r>
-        <w:t>：系统建立"聚合条件—相分离时机—骨架形貌—锁液/力学/传输/界面性能"的定量构效关系，为非均相准固态电解质提供可预测的设计方法。</w:t>
+        <w:t xml:space="preserve"> 聚醚骨架仅有受体位点、只能束缚 Li⁺；酰胺骨架兼具 C=O 受体与 N–H 供体，可作用于 PF₆⁻/DFOB⁻。前期 t_Li⁺ 高于液态及 PEGDA 体系，FTIR 显示 N–H/C=O 峰位移，机理将由 ¹⁹F NMR、PFG 与计算进一步确认。</w:t>
       </w:r>
     </w:p>
     <w:p>
@@ -1538,28 +1392,10 @@
         <w:rPr>
           <w:b/>
         </w:rPr>
-        <w:t>弱溶剂化液相的准固态"原汁原味"保留</w:t>
+        <w:t>结合 LiPF₆/LiDFOB 双盐与氟化溶剂，在凝胶中构筑稳定的正负极界面，实现 Li‖NCM811 在 4.5 V 下的 1C/3C 稳定循环。</w:t>
       </w:r>
       <w:r>
-        <w:t>：首次实现 DMTFA/TTE 基高压弱溶剂化电解液的准固态化，并证明其溶剂化结构、氧化窗口与脱溶剂化动力学不因聚合物引入而劣化。</w:t>
-      </w:r>
-    </w:p>
-    <w:p>
-      <w:pPr>
-        <w:spacing w:line="336" w:lineRule="auto"/>
-        <w:ind w:firstLine="454"/>
-      </w:pPr>
-      <w:r>
-        <w:t>（4）</w:t>
-      </w:r>
-      <w:r>
-        <w:rPr>
-          <w:b/>
-        </w:rPr>
-        <w:t>三源协同双界面及其来源归因</w:t>
-      </w:r>
-      <w:r>
-        <w:t>：以对照实验逐一归因 SEI/CEI 中 B–O（LiDFOB）、LiF（氟化溶剂/DFOB⁻）、含 N 物种（酰胺骨架）的来源，并揭示高比表面骨架表面 N–H 对阴离子的界面作用。</w:t>
+        <w:t xml:space="preserve"> 弱溶剂化体系在高镍 4.5 V 下的高倍率循环多为液态报道，凝胶体系 3C 数据稀少；本工作将溶剂化保留与界面稳定建立因果联系并逐一归因界面组分来源。</w:t>
       </w:r>
     </w:p>
     <w:p>
@@ -1676,7 +1512,7 @@
               <w:rPr>
                 <w:sz w:val="21"/>
               </w:rPr>
-              <w:t>文献调研；溶解度与前驱液状态测定；聚合条件筛选；建立 C0–C3 对照体系；完成转化率、保液率、基础电化学测试</w:t>
+              <w:t>补充 C0/C1/S 对照数据；FTIR 变温与 DFT 分析网络–液相作用；¹⁹F/¹¹B NMR</w:t>
             </w:r>
           </w:p>
         </w:tc>
@@ -1694,7 +1530,7 @@
               <w:rPr>
                 <w:sz w:val="21"/>
               </w:rPr>
-              <w:t>确定基准配方与对照样；完成开题后首批数据</w:t>
+              <w:t>完成内容一；明确酰胺–溶剂/阴离子作用方式</w:t>
             </w:r>
           </w:p>
         </w:tc>
@@ -1714,7 +1550,7 @@
               <w:rPr>
                 <w:sz w:val="21"/>
               </w:rPr>
-              <w:t>【2027.03–2027.06】</w:t>
+              <w:t>【2027.03–2027.08】</w:t>
             </w:r>
           </w:p>
         </w:tc>
@@ -1732,7 +1568,7 @@
               <w:rPr>
                 <w:sz w:val="21"/>
               </w:rPr>
-              <w:t>内容一：骨架形貌（SEM/BET/SAXS）、Raman/NMR/DSC 解耦证据链；内容三：溶剂化结构与传输（PFG-NMR、变温 EIS、LSV）</w:t>
+              <w:t>PFG-NMR、变温 EIS/DRT、MD 模拟；系统阐明传输机理与迁移数来源</w:t>
             </w:r>
           </w:p>
         </w:tc>
@@ -1750,7 +1586,7 @@
               <w:rPr>
                 <w:sz w:val="21"/>
               </w:rPr>
-              <w:t>形成"相分离解耦"机理论文初稿</w:t>
+              <w:t>完成内容二；第一篇论文投稿</w:t>
             </w:r>
           </w:p>
         </w:tc>
@@ -1770,7 +1606,7 @@
               <w:rPr>
                 <w:sz w:val="21"/>
               </w:rPr>
-              <w:t>【2027.07–2027.12】</w:t>
+              <w:t>【2027.09–2028.02】</w:t>
             </w:r>
           </w:p>
         </w:tc>
@@ -1788,7 +1624,7 @@
               <w:rPr>
                 <w:sz w:val="21"/>
               </w:rPr>
-              <w:t>内容二：形貌梯度系列制备与原位相分离跟踪；构效关系与权衡图；MD/DFT 计算</w:t>
+              <w:t>XPS 深度剖析/TOF-SIMS 界面归因；Li‖Cu、Li‖Li 长循环；TEM/ICP</w:t>
             </w:r>
           </w:p>
         </w:tc>
@@ -1806,7 +1642,7 @@
               <w:rPr>
                 <w:sz w:val="21"/>
               </w:rPr>
-              <w:t>确定最优形貌窗口；第一篇论文投稿</w:t>
+              <w:t>完成内容三</w:t>
             </w:r>
           </w:p>
         </w:tc>
@@ -1826,7 +1662,7 @@
               <w:rPr>
                 <w:sz w:val="21"/>
               </w:rPr>
-              <w:t>【2028.01–2028.06】</w:t>
+              <w:t>【2028.03–2028.08】</w:t>
             </w:r>
           </w:p>
         </w:tc>
@@ -1844,7 +1680,7 @@
               <w:rPr>
                 <w:sz w:val="21"/>
               </w:rPr>
-              <w:t>内容四：XPS/TOF-SIMS 界面归因；Li‖Cu、Li‖Li、全电池循环/倍率/高低温/安全测试；循环后拆解</w:t>
+              <w:t>Li‖NCM811 长循环、倍率、高低温、安全性；软包验证；循环后回溯</w:t>
             </w:r>
           </w:p>
         </w:tc>
@@ -1862,7 +1698,7 @@
               <w:rPr>
                 <w:sz w:val="21"/>
               </w:rPr>
-              <w:t>第二篇论文初稿；专利申请</w:t>
+              <w:t>完成内容四；第二篇论文；专利申请</w:t>
             </w:r>
           </w:p>
         </w:tc>
@@ -1882,7 +1718,7 @@
               <w:rPr>
                 <w:sz w:val="21"/>
               </w:rPr>
-              <w:t>【2028.07–2028.12】</w:t>
+              <w:t>【2028.09–2028.12】</w:t>
             </w:r>
           </w:p>
         </w:tc>
@@ -1900,7 +1736,7 @@
               <w:rPr>
                 <w:sz w:val="21"/>
               </w:rPr>
-              <w:t>数据补充与完善，论文撰写与答辩</w:t>
+              <w:t>数据完善、学位论文撰写与答辩</w:t>
             </w:r>
           </w:p>
         </w:tc>
@@ -1939,7 +1775,7 @@
         <w:ind w:firstLine="454"/>
       </w:pPr>
       <w:r>
-        <w:t>（1）阐明 PIPS 型酰胺骨架准固态电解质的解耦传输机制与三源界面成膜化学，建立相分离调控的构效关系；</w:t>
+        <w:t>（1）阐明酰胺网络凝胶电解质保持弱溶剂化结构、提升迁移数的机理及双界面成膜化学；</w:t>
       </w:r>
     </w:p>
     <w:p>
@@ -1948,7 +1784,7 @@
         <w:ind w:firstLine="454"/>
       </w:pPr>
       <w:r>
-        <w:t>（2）获得一种原位聚合、阻燃、不漏液、兼容【4.5 V 高压正极】的准固态电解质，全电池性能达到【目标指标】；</w:t>
+        <w:t>（2）获得一种原位聚合、阻燃、不漏液、支持 Li‖NCM811 4.5 V 1C/3C 稳定循环的凝胶电解质；</w:t>
       </w:r>
     </w:p>
     <w:p>
@@ -2021,7 +1857,7 @@
         <w:ind w:firstLine="454"/>
       </w:pPr>
       <w:r>
-        <w:t>（1）完成了 1.0 M LiPF₆ + 0.2 M LiDFOB / DMTFA : TTE = 1 : 1 液态电解液的配制与基础电化学评价【电导率、窗口数据】；</w:t>
+        <w:t>（1）完成 1.0 M LiPF₆ + 0.2 M LiDFOB / DMTFA : TTE = 1 : 1 液态电解液及 MBA、PEGDA 两种原位凝胶电解质的制备；FTIR 确认单体 C=C 完全转化（图【1】）。</w:t>
       </w:r>
     </w:p>
     <w:p>
@@ -2030,7 +1866,16 @@
         <w:ind w:firstLine="454"/>
       </w:pPr>
       <w:r>
-        <w:t>（2）实现了 MBA 与 PEGDA 两种单体在该液相中的原位聚合，并发现 MBA 体系前驱液与产物呈白色、非均相（聚合诱导相分离），PEGDA 体系为均相透明凝胶；</w:t>
+        <w:t>（2）</w:t>
+      </w:r>
+      <w:r>
+        <w:rPr>
+          <w:b/>
+        </w:rPr>
+        <w:t>溶剂化结构</w:t>
+      </w:r>
+      <w:r>
+        <w:t>：拉曼（PF₆⁻ 740 cm⁻¹ 区、DMTFA C=O 区）与 ⁷Li NMR 显示 MBA 凝胶与液态电解液谱图基本一致，PEGDA 凝胶出现明显变化（图【2】），表明酰胺网络凝胶化未改变 Li⁺ 溶剂化结构。</w:t>
       </w:r>
     </w:p>
     <w:p>
@@ -2039,7 +1884,16 @@
         <w:ind w:firstLine="454"/>
       </w:pPr>
       <w:r>
-        <w:t>（3）初步电化学对比表明 MBA 体系的【离子电导率 / 对称电池极化 / 全电池循环】优于 PEGDA 体系【填具体数据与图号】，为"相分离解耦"核心假设提供了初步证据；</w:t>
+        <w:t>（3）</w:t>
+      </w:r>
+      <w:r>
+        <w:rPr>
+          <w:b/>
+        </w:rPr>
+        <w:t>传输性能</w:t>
+      </w:r>
+      <w:r>
+        <w:t>：室温离子电导率 MBA 凝胶【x】mS cm⁻¹、液态【y】mS cm⁻¹、PEGDA 凝胶【z】mS cm⁻¹；Li⁺ 迁移数 MBA 凝胶【a】、液态【b】、PEGDA 凝胶【c】（图【3】）。</w:t>
       </w:r>
     </w:p>
     <w:p>
@@ -2048,7 +1902,16 @@
         <w:ind w:firstLine="454"/>
       </w:pPr>
       <w:r>
-        <w:t>（4）【已完成的其他表征：FTIR 转化率、SEM、保液率等】；</w:t>
+        <w:t>（4）</w:t>
+      </w:r>
+      <w:r>
+        <w:rPr>
+          <w:b/>
+        </w:rPr>
+        <w:t>网络–液相作用</w:t>
+      </w:r>
+      <w:r>
+        <w:t>：FTIR 显示凝胶中 N–H / 酰胺 I 带相对单体及干聚合物位移【Δ】cm⁻¹，DMTFA C=O 带位移【Δ'】cm⁻¹（图【4】），提示酰胺基团与溶剂/阴离子存在氢键作用。</w:t>
       </w:r>
     </w:p>
     <w:p>
@@ -2057,7 +1920,52 @@
         <w:ind w:firstLine="454"/>
       </w:pPr>
       <w:r>
-        <w:t>（5）【已发表/投稿论文、参与项目、获奖等】。</w:t>
+        <w:t>（5）</w:t>
+      </w:r>
+      <w:r>
+        <w:rPr>
+          <w:b/>
+        </w:rPr>
+        <w:t>电化学稳定性与界面</w:t>
+      </w:r>
+      <w:r>
+        <w:t>：LSV 氧化窗口【V】vs Li/Li⁺；Li‖Li 对称电池在【电流密度】下稳定循环【h】（图【5】）。</w:t>
+      </w:r>
+    </w:p>
+    <w:p>
+      <w:pPr>
+        <w:spacing w:line="336" w:lineRule="auto"/>
+        <w:ind w:firstLine="454"/>
+      </w:pPr>
+      <w:r>
+        <w:t>（6）</w:t>
+      </w:r>
+      <w:r>
+        <w:rPr>
+          <w:b/>
+        </w:rPr>
+        <w:t>全电池</w:t>
+      </w:r>
+      <w:r>
+        <w:t>：Li‖NCM811 在 4.5 V 下 1C 循环【n₁】周容量保持率【%】，3C 循环【n₂】周容量保持率【%】（图【6】）。</w:t>
+      </w:r>
+    </w:p>
+    <w:p>
+      <w:pPr>
+        <w:spacing w:line="336" w:lineRule="auto"/>
+        <w:ind w:firstLine="454"/>
+      </w:pPr>
+      <w:r>
+        <w:t>（7）结构观察：MBA 凝胶呈白色非均相结构，PEGDA 凝胶为透明均相结构，已列入内容一作进一步形貌与 DSC 分析。</w:t>
+      </w:r>
+    </w:p>
+    <w:p>
+      <w:pPr>
+        <w:spacing w:line="336" w:lineRule="auto"/>
+        <w:ind w:firstLine="454"/>
+      </w:pPr>
+      <w:r>
+        <w:t>（8）【已发表/投稿论文、参与项目、获奖等】</w:t>
       </w:r>
     </w:p>
     <w:p>
@@ -2087,7 +1995,7 @@
         <w:pStyle w:val="ListBullet"/>
       </w:pPr>
       <w:r>
-        <w:t>手套箱、真空烘箱、UV 固化/恒温聚合装置，可完成前驱液配制与原位聚合；</w:t>
+        <w:t>手套箱、真空烘箱、恒温聚合装置，可完成前驱液配制与原位聚合；</w:t>
       </w:r>
     </w:p>
     <w:p>
@@ -2103,7 +2011,7 @@
         <w:pStyle w:val="ListBullet"/>
       </w:pPr>
       <w:r>
-        <w:t>【FTIR、Raman、SEM、XRD、TGA/DSC、流变仪、接触角等——按实际勾选】；</w:t>
+        <w:t>FTIR、Raman、【SEM、XRD、TGA/DSC、流变仪——按实际勾选】；</w:t>
       </w:r>
     </w:p>
     <w:p>
@@ -2111,7 +2019,7 @@
         <w:pStyle w:val="ListBullet"/>
       </w:pPr>
       <w:r>
-        <w:t>学校/学院分析测试中心可提供 XPS、NMR、BET 等测试；</w:t>
+        <w:t>学校分析测试中心可提供 XPS、NMR、BET 等测试；</w:t>
       </w:r>
     </w:p>
     <w:p>
@@ -2119,7 +2027,7 @@
         <w:pStyle w:val="ListBullet"/>
       </w:pPr>
       <w:r>
-        <w:t>文献数据库（Web of Science、SciFinder、CNKI）访问权限。</w:t>
+        <w:t>文献数据库访问权限。</w:t>
       </w:r>
     </w:p>
     <w:p>
@@ -2336,7 +2244,7 @@
               <w:rPr>
                 <w:sz w:val="21"/>
               </w:rPr>
-              <w:t>cryo-SEM / cryo-TEM</w:t>
+              <w:t>cryo-TEM</w:t>
             </w:r>
           </w:p>
         </w:tc>
@@ -2354,7 +2262,7 @@
               <w:rPr>
                 <w:sz w:val="21"/>
               </w:rPr>
-              <w:t>含液骨架与 SEI 原位形貌</w:t>
+              <w:t>SEI/CEI 纳米结构</w:t>
             </w:r>
           </w:p>
         </w:tc>
@@ -2372,63 +2280,7 @@
               <w:rPr>
                 <w:sz w:val="21"/>
               </w:rPr>
-              <w:t>【与 XX 课题组合作；先以抽提后常规 SEM 替代】</w:t>
-            </w:r>
-          </w:p>
-        </w:tc>
-      </w:tr>
-      <w:tr>
-        <w:tc>
-          <w:tcPr>
-            <w:tcW w:type="dxa" w:w="3135"/>
-          </w:tcPr>
-          <w:p>
-            <w:r>
-              <w:rPr>
-                <w:sz w:val="21"/>
-              </w:rPr>
-            </w:r>
-            <w:r>
-              <w:rPr>
-                <w:sz w:val="21"/>
-              </w:rPr>
-              <w:t>原位透光率/散射装置</w:t>
-            </w:r>
-          </w:p>
-        </w:tc>
-        <w:tc>
-          <w:tcPr>
-            <w:tcW w:type="dxa" w:w="3135"/>
-          </w:tcPr>
-          <w:p>
-            <w:r>
-              <w:rPr>
-                <w:sz w:val="21"/>
-              </w:rPr>
-            </w:r>
-            <w:r>
-              <w:rPr>
-                <w:sz w:val="21"/>
-              </w:rPr>
-              <w:t>跟踪相分离时机</w:t>
-            </w:r>
-          </w:p>
-        </w:tc>
-        <w:tc>
-          <w:tcPr>
-            <w:tcW w:type="dxa" w:w="3135"/>
-          </w:tcPr>
-          <w:p>
-            <w:r>
-              <w:rPr>
-                <w:sz w:val="21"/>
-              </w:rPr>
-            </w:r>
-            <w:r>
-              <w:rPr>
-                <w:sz w:val="21"/>
-              </w:rPr>
-              <w:t>自行搭建（激光 + 光电二极管 + 恒温台），成本低</w:t>
+              <w:t>【与 XX 课题组合作】</w:t>
             </w:r>
           </w:p>
         </w:tc>
@@ -2466,7 +2318,7 @@
               <w:rPr>
                 <w:sz w:val="21"/>
               </w:rPr>
-              <w:t>溶剂化结构与结合能</w:t>
+              <w:t>溶剂化结构、氢键/配位结合能</w:t>
             </w:r>
           </w:p>
         </w:tc>
@@ -2504,7 +2356,7 @@
               <w:rPr>
                 <w:sz w:val="21"/>
               </w:rPr>
-              <w:t>高压正极材料与锂金属</w:t>
+              <w:t>软包电池组装</w:t>
             </w:r>
           </w:p>
         </w:tc>
@@ -2522,7 +2374,7 @@
               <w:rPr>
                 <w:sz w:val="21"/>
               </w:rPr>
-              <w:t>全电池验证</w:t>
+              <w:t>实用化验证</w:t>
             </w:r>
           </w:p>
         </w:tc>
@@ -2540,7 +2392,7 @@
               <w:rPr>
                 <w:sz w:val="21"/>
               </w:rPr>
-              <w:t>商业采购</w:t>
+              <w:t>【合作单位 / 中试平台】</w:t>
             </w:r>
           </w:p>
         </w:tc>

</xml_diff>